<commit_message>
Correct abstract speedup numbers to match Tables 3 and 4
</commit_message>
<xml_diff>
--- a/RustyClean_Manuscript_Draft.docx
+++ b/RustyClean_Manuscript_Draft.docx
@@ -229,58 +229,43 @@
         <w:t xml:space="preserve"> </w:t>
       </w:r>
       <w:r>
-        <w:t xml:space="preserve">10–13× faster than KneadData on the host-removal step and 5.7–6.1×</w:t>
-      </w:r>
-      <w:r>
-        <w:t xml:space="preserve"> </w:t>
-      </w:r>
-      <w:r>
-        <w:t xml:space="preserve">faster for the full QC-plus-depletion pipeline, while discarding less</w:t>
-      </w:r>
-      <w:r>
-        <w:t xml:space="preserve"> </w:t>
-      </w:r>
-      <w:r>
-        <w:t xml:space="preserve">microbial signal (mean 0.20% against 2.58% across the four-dataset</w:t>
-      </w:r>
-      <w:r>
-        <w:t xml:space="preserve"> </w:t>
-      </w:r>
-      <w:r>
-        <w:t xml:space="preserve">evaluation panel). Against Hostile, a</w:t>
-      </w:r>
-      <w:r>
-        <w:t xml:space="preserve"> </w:t>
-      </w:r>
-      <w:r>
-        <w:t xml:space="preserve">purpose-built depletion tool, RustyClean’s depletion-only step</w:t>
-      </w:r>
-      <w:r>
-        <w:t xml:space="preserve"> </w:t>
-      </w:r>
-      <w:r>
-        <w:t xml:space="preserve">(</w:t>
-      </w:r>
-      <w:r>
-        <w:rPr>
-          <w:rStyle w:val="VerbatimChar"/>
-        </w:rPr>
-        <w:t xml:space="preserve">--skip-qc</w:t>
-      </w:r>
-      <w:r>
-        <w:t xml:space="preserve">) was 1.3–1.9× faster on a matched panel spanning 30–100 M</w:t>
-      </w:r>
-      <w:r>
-        <w:t xml:space="preserve"> </w:t>
-      </w:r>
-      <w:r>
-        <w:t xml:space="preserve">reads and 50–90% host content, with a small accuracy gap on the 100 M</w:t>
-      </w:r>
-      <w:r>
-        <w:t xml:space="preserve"> </w:t>
-      </w:r>
-      <w:r>
-        <w:t xml:space="preserve">subset (ΔF1 ≈ 0.0019 at 50% host, ΔF1 ≈ 0.0041 at 90% host).</w:t>
+        <w:t xml:space="preserve">1.3–1.9× faster than Hostile and 6.6–10.7× faster than KneadData on</w:t>
+      </w:r>
+      <w:r>
+        <w:t xml:space="preserve"> </w:t>
+      </w:r>
+      <w:r>
+        <w:t xml:space="preserve">the host-removal step on a matched panel spanning 30–100 M reads and</w:t>
+      </w:r>
+      <w:r>
+        <w:t xml:space="preserve"> </w:t>
+      </w:r>
+      <w:r>
+        <w:t xml:space="preserve">50–90% host content. For the full QC-plus-depletion pipeline on the</w:t>
+      </w:r>
+      <w:r>
+        <w:t xml:space="preserve"> </w:t>
+      </w:r>
+      <w:r>
+        <w:t xml:space="preserve">four-dataset panel it was 2.5–4.6× faster than KneadData, while</w:t>
+      </w:r>
+      <w:r>
+        <w:t xml:space="preserve"> </w:t>
+      </w:r>
+      <w:r>
+        <w:t xml:space="preserve">discarding less microbial signal (mean 0.20% against 2.58%). Against</w:t>
+      </w:r>
+      <w:r>
+        <w:t xml:space="preserve"> </w:t>
+      </w:r>
+      <w:r>
+        <w:t xml:space="preserve">Hostile the accuracy gap remained small (ΔF1 ≈ 0.0019 at 50% host,</w:t>
+      </w:r>
+      <w:r>
+        <w:t xml:space="preserve"> </w:t>
+      </w:r>
+      <w:r>
+        <w:t xml:space="preserve">ΔF1 ≈ 0.0041 at 90% host).</w:t>
       </w:r>
       <w:r>
         <w:t xml:space="preserve"> </w:t>

</xml_diff>

<commit_message>
Clarify Kraken2 DB as T2T-only human index (~15.5 GB)
</commit_message>
<xml_diff>
--- a/RustyClean_Manuscript_Draft.docx
+++ b/RustyClean_Manuscript_Draft.docx
@@ -271,19 +271,25 @@
         <w:t xml:space="preserve"> </w:t>
       </w:r>
       <w:r>
-        <w:t xml:space="preserve">The Kraken2-based path trades a larger memory footprint (~16 GB versus</w:t>
-      </w:r>
-      <w:r>
-        <w:t xml:space="preserve"> </w:t>
-      </w:r>
-      <w:r>
-        <w:t xml:space="preserve">~4 GB for Hostile) for classification speed, and the optional Bowtie2</w:t>
-      </w:r>
-      <w:r>
-        <w:t xml:space="preserve"> </w:t>
-      </w:r>
-      <w:r>
-        <w:t xml:space="preserve">recheck recovers most host reads that Kraken2 misses. RustyClean is a single Rust</w:t>
+        <w:t xml:space="preserve">The Kraken2-based path trades a larger memory footprint (~15.5 GB for</w:t>
+      </w:r>
+      <w:r>
+        <w:t xml:space="preserve"> </w:t>
+      </w:r>
+      <w:r>
+        <w:t xml:space="preserve">the T2T-only human index versus ~3.6 GB for Hostile) for classification</w:t>
+      </w:r>
+      <w:r>
+        <w:t xml:space="preserve"> </w:t>
+      </w:r>
+      <w:r>
+        <w:t xml:space="preserve">speed, and the optional Bowtie2 recheck recovers most host reads that</w:t>
+      </w:r>
+      <w:r>
+        <w:t xml:space="preserve"> </w:t>
+      </w:r>
+      <w:r>
+        <w:t xml:space="preserve">Kraken2 misses. RustyClean is a single Rust</w:t>
       </w:r>
       <w:r>
         <w:t xml:space="preserve"> </w:t>
@@ -7423,19 +7429,19 @@
         <w:t xml:space="preserve"> </w:t>
       </w:r>
       <w:r>
-        <w:t xml:space="preserve">essentially the resident size of the human-only Kraken2 index</w:t>
-      </w:r>
-      <w:r>
-        <w:t xml:space="preserve"> </w:t>
-      </w:r>
-      <w:r>
-        <w:t xml:space="preserve">(Kraken16, ~16 GB) plus the working set of the Bowtie2 recheck pass over</w:t>
-      </w:r>
-      <w:r>
-        <w:t xml:space="preserve"> </w:t>
-      </w:r>
-      <w:r>
-        <w:t xml:space="preserve">the retained reads.</w:t>
+        <w:t xml:space="preserve">essentially the resident size of the T2T-only human Kraken2 index</w:t>
+      </w:r>
+      <w:r>
+        <w:t xml:space="preserve"> </w:t>
+      </w:r>
+      <w:r>
+        <w:t xml:space="preserve">(~15.5 GB) plus the working set of the Bowtie2 recheck pass over the</w:t>
+      </w:r>
+      <w:r>
+        <w:t xml:space="preserve"> </w:t>
+      </w:r>
+      <w:r>
+        <w:t xml:space="preserve">retained reads.</w:t>
       </w:r>
     </w:p>
     <w:p>
@@ -8967,7 +8973,7 @@
               <w:pStyle w:val="Compact"/>
             </w:pPr>
             <w:r>
-              <w:t xml:space="preserve">Default path uses a human-only Kraken2 index (~16 GB). Memory is bounded by DB size, not sample size, and the memory-aware worker cap prevents overload (Section 2.8). Users can force the Bowtie2 path for low-memory environments.</w:t>
+              <w:t xml:space="preserve">Default path uses a T2T-only human Kraken2 index (~15.5 GB). Memory is bounded by DB size, not sample size, and the memory-aware worker cap prevents overload (Section 2.8). Users can force the Bowtie2 path for low-memory environments.</w:t>
             </w:r>
           </w:p>
         </w:tc>

</xml_diff>